<commit_message>
Add reserved Zenodo DOIs to the manuscript, cover letter, and README
Co-Authored-By: Claude Sonnet 5 <noreply@anthropic.com>
</commit_message>
<xml_diff>
--- a/manuscript/LANDMAP_EMA_Cover_Letter.docx
+++ b/manuscript/LANDMAP_EMA_Cover_Letter.docx
@@ -177,7 +177,18 @@
         <w:rPr>
           <w:b w:val="0"/>
         </w:rPr>
-        <w:t>An earlier, non-quantitative description of the architecture was submitted by me in response to an industrial open-innovation challenge focused on landfill mining. That submission was not peer reviewed or published and contained none of the models, validation protocol, or results reported here. The manuscript is original, is not under consideration elsewhere, and has not been published. I am the sole author, I have no competing interests, and the work received no external funding. The synthetic-survey generator, classification and economic models, robustness sweep and figure generators are openly available at https://github.com/sandlerleon/landmap-sensor-fusion. Generative AI (Claude, Anthropic) assisted with literature search, model implementation and drafting; I reviewed and edited all content, verified every cited reference against its source via Crossref (correcting one incorrect DOI I had used in an earlier, non-peer-reviewed version of this material), and take full responsibility for the manuscript, as stated in its Declarations.</w:t>
+        <w:t>An earlier, non-quantitative description of the architecture was submitted by me in response to an industrial open-innovation challenge focused on landfill mining. That submission was not peer reviewed or published and contained none of the models, validation protocol, or results reported here. The manuscript is original, is not under consideration elsewhere, and has not been published. I am the sole author, I have no competing interests, and the work received no external funding. The synthetic-survey generator, classification and economic models, robustness sweep and figure generators are openly available at https://github.com/sandlerleon/landmap-sensor-fusion and archived at https://doi.org/10.5281/zenodo.22984668. Generative AI (Claude, Anthropic) assisted with literature search, model implementation and drafting; I reviewed and edited all content, verified every cited reference against its source via Crossref (correcting one incorrect DOI I had used in an earlier, non-peer-reviewed version of this material), and take full responsibility for the manuscript, as stated in its Declarations.</w:t>
+      </w:r>
+    </w:p>
+    <w:p>
+      <w:pPr>
+        <w:spacing w:after="180"/>
+      </w:pPr>
+      <w:r>
+        <w:rPr>
+          <w:b w:val="0"/>
+        </w:rPr>
+        <w:t>A preprint of the manuscript is deposited at https://doi.org/10.5281/zenodo.22984670, as permitted by Springer's preprint policy.</w:t>
       </w:r>
     </w:p>
     <w:p>

</xml_diff>